<commit_message>
pipeline working end to end
</commit_message>
<xml_diff>
--- a/Outputs/table2.docx
+++ b/Outputs/table2.docx
@@ -48,6 +48,7 @@
                 <w:i w:val="true"/>
                 <w:b w:val="true"/>
                 <w:u w:val="none"/>
+                <w:strike w:val="false"/>
                 <w:sz w:val="20"/>
                 <w:szCs w:val="20"/>
                 <w:color w:val="000000"/>
@@ -59,6 +60,7 @@
                 <w:i w:val="true"/>
                 <w:b w:val="true"/>
                 <w:u w:val="none"/>
+                <w:strike w:val="false"/>
                 <w:sz w:val="20"/>
                 <w:szCs w:val="20"/>
                 <w:color w:val="000000"/>
@@ -100,6 +102,7 @@
                 <w:i w:val="true"/>
                 <w:b w:val="true"/>
                 <w:u w:val="none"/>
+                <w:strike w:val="false"/>
                 <w:sz w:val="20"/>
                 <w:szCs w:val="20"/>
                 <w:color w:val="000000"/>
@@ -111,6 +114,7 @@
                 <w:i w:val="true"/>
                 <w:b w:val="true"/>
                 <w:u w:val="none"/>
+                <w:strike w:val="false"/>
                 <w:sz w:val="20"/>
                 <w:szCs w:val="20"/>
                 <w:color w:val="000000"/>
@@ -123,6 +127,7 @@
                 <w:i w:val="true"/>
                 <w:b w:val="true"/>
                 <w:u w:val="none"/>
+                <w:strike w:val="false"/>
                 <w:sz w:val="20"/>
                 <w:szCs w:val="20"/>
                 <w:color w:val="000000"/>
@@ -135,6 +140,7 @@
                 <w:i w:val="true"/>
                 <w:b w:val="true"/>
                 <w:u w:val="none"/>
+                <w:strike w:val="false"/>
                 <w:sz w:val="20"/>
                 <w:szCs w:val="20"/>
                 <w:color w:val="000000"/>
@@ -176,6 +182,7 @@
                 <w:i w:val="true"/>
                 <w:b w:val="true"/>
                 <w:u w:val="none"/>
+                <w:strike w:val="false"/>
                 <w:sz w:val="20"/>
                 <w:szCs w:val="20"/>
                 <w:color w:val="000000"/>
@@ -187,6 +194,7 @@
                 <w:i w:val="true"/>
                 <w:b w:val="true"/>
                 <w:u w:val="none"/>
+                <w:strike w:val="false"/>
                 <w:sz w:val="20"/>
                 <w:szCs w:val="20"/>
                 <w:color w:val="000000"/>
@@ -199,6 +207,7 @@
                 <w:i w:val="true"/>
                 <w:b w:val="true"/>
                 <w:u w:val="none"/>
+                <w:strike w:val="false"/>
                 <w:sz w:val="20"/>
                 <w:szCs w:val="20"/>
                 <w:color w:val="000000"/>
@@ -211,6 +220,7 @@
                 <w:i w:val="true"/>
                 <w:b w:val="true"/>
                 <w:u w:val="none"/>
+                <w:strike w:val="false"/>
                 <w:sz w:val="20"/>
                 <w:szCs w:val="20"/>
                 <w:color w:val="000000"/>
@@ -252,6 +262,7 @@
                 <w:i w:val="true"/>
                 <w:b w:val="true"/>
                 <w:u w:val="none"/>
+                <w:strike w:val="false"/>
                 <w:sz w:val="20"/>
                 <w:szCs w:val="20"/>
                 <w:color w:val="000000"/>
@@ -263,6 +274,7 @@
                 <w:i w:val="true"/>
                 <w:b w:val="true"/>
                 <w:u w:val="none"/>
+                <w:strike w:val="false"/>
                 <w:sz w:val="20"/>
                 <w:szCs w:val="20"/>
                 <w:color w:val="000000"/>
@@ -275,6 +287,7 @@
                 <w:i w:val="true"/>
                 <w:b w:val="true"/>
                 <w:u w:val="none"/>
+                <w:strike w:val="false"/>
                 <w:sz w:val="20"/>
                 <w:szCs w:val="20"/>
                 <w:color w:val="000000"/>
@@ -287,6 +300,7 @@
                 <w:i w:val="true"/>
                 <w:b w:val="true"/>
                 <w:u w:val="none"/>
+                <w:strike w:val="false"/>
                 <w:sz w:val="20"/>
                 <w:szCs w:val="20"/>
                 <w:color w:val="000000"/>
@@ -328,6 +342,7 @@
                 <w:i w:val="true"/>
                 <w:b w:val="true"/>
                 <w:u w:val="none"/>
+                <w:strike w:val="false"/>
                 <w:sz w:val="20"/>
                 <w:szCs w:val="20"/>
                 <w:color w:val="000000"/>
@@ -339,6 +354,7 @@
                 <w:i w:val="true"/>
                 <w:b w:val="true"/>
                 <w:u w:val="none"/>
+                <w:strike w:val="false"/>
                 <w:sz w:val="20"/>
                 <w:szCs w:val="20"/>
                 <w:color w:val="000000"/>
@@ -351,6 +367,7 @@
                 <w:i w:val="true"/>
                 <w:b w:val="true"/>
                 <w:u w:val="none"/>
+                <w:strike w:val="false"/>
                 <w:sz w:val="20"/>
                 <w:szCs w:val="20"/>
                 <w:color w:val="000000"/>
@@ -363,6 +380,7 @@
                 <w:i w:val="true"/>
                 <w:b w:val="true"/>
                 <w:u w:val="none"/>
+                <w:strike w:val="false"/>
                 <w:sz w:val="20"/>
                 <w:szCs w:val="20"/>
                 <w:color w:val="000000"/>
@@ -404,6 +422,7 @@
                 <w:i w:val="true"/>
                 <w:b w:val="true"/>
                 <w:u w:val="none"/>
+                <w:strike w:val="false"/>
                 <w:sz w:val="20"/>
                 <w:szCs w:val="20"/>
                 <w:color w:val="000000"/>
@@ -415,6 +434,7 @@
                 <w:i w:val="true"/>
                 <w:b w:val="true"/>
                 <w:u w:val="none"/>
+                <w:strike w:val="false"/>
                 <w:sz w:val="20"/>
                 <w:szCs w:val="20"/>
                 <w:color w:val="000000"/>
@@ -427,6 +447,7 @@
                 <w:i w:val="true"/>
                 <w:b w:val="true"/>
                 <w:u w:val="none"/>
+                <w:strike w:val="false"/>
                 <w:sz w:val="20"/>
                 <w:szCs w:val="20"/>
                 <w:color w:val="000000"/>
@@ -439,6 +460,7 @@
                 <w:i w:val="true"/>
                 <w:b w:val="true"/>
                 <w:u w:val="none"/>
+                <w:strike w:val="false"/>
                 <w:sz w:val="20"/>
                 <w:szCs w:val="20"/>
                 <w:color w:val="000000"/>
@@ -486,17 +508,19 @@
                 <w:i w:val="false"/>
                 <w:b w:val="true"/>
                 <w:u w:val="none"/>
-                <w:sz w:val="20"/>
-                <w:szCs w:val="20"/>
-                <w:color w:val="000000"/>
-              </w:rPr>
-            </w:pPr>
-            <w:r>
-              <w:rPr>
-                <w:rFonts w:ascii="Helvetica" w:hAnsi="Helvetica" w:eastAsia="Helvetica" w:cs="Helvetica"/>
-                <w:i w:val="false"/>
-                <w:b w:val="true"/>
-                <w:u w:val="none"/>
+                <w:strike w:val="false"/>
+                <w:sz w:val="20"/>
+                <w:szCs w:val="20"/>
+                <w:color w:val="000000"/>
+              </w:rPr>
+            </w:pPr>
+            <w:r>
+              <w:rPr>
+                <w:rFonts w:ascii="Helvetica" w:hAnsi="Helvetica" w:eastAsia="Helvetica" w:cs="Helvetica"/>
+                <w:i w:val="false"/>
+                <w:b w:val="true"/>
+                <w:u w:val="none"/>
+                <w:strike w:val="false"/>
                 <w:sz w:val="20"/>
                 <w:szCs w:val="20"/>
                 <w:color w:val="000000"/>
@@ -538,17 +562,19 @@
                 <w:i w:val="false"/>
                 <w:b w:val="true"/>
                 <w:u w:val="none"/>
-                <w:sz w:val="20"/>
-                <w:szCs w:val="20"/>
-                <w:color w:val="000000"/>
-              </w:rPr>
-            </w:pPr>
-            <w:r>
-              <w:rPr>
-                <w:rFonts w:ascii="Helvetica" w:hAnsi="Helvetica" w:eastAsia="Helvetica" w:cs="Helvetica"/>
-                <w:i w:val="false"/>
-                <w:b w:val="true"/>
-                <w:u w:val="none"/>
+                <w:strike w:val="false"/>
+                <w:sz w:val="20"/>
+                <w:szCs w:val="20"/>
+                <w:color w:val="000000"/>
+              </w:rPr>
+            </w:pPr>
+            <w:r>
+              <w:rPr>
+                <w:rFonts w:ascii="Helvetica" w:hAnsi="Helvetica" w:eastAsia="Helvetica" w:cs="Helvetica"/>
+                <w:i w:val="false"/>
+                <w:b w:val="true"/>
+                <w:u w:val="none"/>
+                <w:strike w:val="false"/>
                 <w:sz w:val="20"/>
                 <w:szCs w:val="20"/>
                 <w:color w:val="000000"/>
@@ -590,17 +616,19 @@
                 <w:i w:val="false"/>
                 <w:b w:val="true"/>
                 <w:u w:val="none"/>
-                <w:sz w:val="20"/>
-                <w:szCs w:val="20"/>
-                <w:color w:val="000000"/>
-              </w:rPr>
-            </w:pPr>
-            <w:r>
-              <w:rPr>
-                <w:rFonts w:ascii="Helvetica" w:hAnsi="Helvetica" w:eastAsia="Helvetica" w:cs="Helvetica"/>
-                <w:i w:val="false"/>
-                <w:b w:val="true"/>
-                <w:u w:val="none"/>
+                <w:strike w:val="false"/>
+                <w:sz w:val="20"/>
+                <w:szCs w:val="20"/>
+                <w:color w:val="000000"/>
+              </w:rPr>
+            </w:pPr>
+            <w:r>
+              <w:rPr>
+                <w:rFonts w:ascii="Helvetica" w:hAnsi="Helvetica" w:eastAsia="Helvetica" w:cs="Helvetica"/>
+                <w:i w:val="false"/>
+                <w:b w:val="true"/>
+                <w:u w:val="none"/>
+                <w:strike w:val="false"/>
                 <w:sz w:val="20"/>
                 <w:szCs w:val="20"/>
                 <w:color w:val="000000"/>
@@ -642,17 +670,19 @@
                 <w:i w:val="false"/>
                 <w:b w:val="true"/>
                 <w:u w:val="none"/>
-                <w:sz w:val="20"/>
-                <w:szCs w:val="20"/>
-                <w:color w:val="000000"/>
-              </w:rPr>
-            </w:pPr>
-            <w:r>
-              <w:rPr>
-                <w:rFonts w:ascii="Helvetica" w:hAnsi="Helvetica" w:eastAsia="Helvetica" w:cs="Helvetica"/>
-                <w:i w:val="false"/>
-                <w:b w:val="true"/>
-                <w:u w:val="none"/>
+                <w:strike w:val="false"/>
+                <w:sz w:val="20"/>
+                <w:szCs w:val="20"/>
+                <w:color w:val="000000"/>
+              </w:rPr>
+            </w:pPr>
+            <w:r>
+              <w:rPr>
+                <w:rFonts w:ascii="Helvetica" w:hAnsi="Helvetica" w:eastAsia="Helvetica" w:cs="Helvetica"/>
+                <w:i w:val="false"/>
+                <w:b w:val="true"/>
+                <w:u w:val="none"/>
+                <w:strike w:val="false"/>
                 <w:sz w:val="20"/>
                 <w:szCs w:val="20"/>
                 <w:color w:val="000000"/>
@@ -694,17 +724,19 @@
                 <w:i w:val="false"/>
                 <w:b w:val="true"/>
                 <w:u w:val="none"/>
-                <w:sz w:val="20"/>
-                <w:szCs w:val="20"/>
-                <w:color w:val="000000"/>
-              </w:rPr>
-            </w:pPr>
-            <w:r>
-              <w:rPr>
-                <w:rFonts w:ascii="Helvetica" w:hAnsi="Helvetica" w:eastAsia="Helvetica" w:cs="Helvetica"/>
-                <w:i w:val="false"/>
-                <w:b w:val="true"/>
-                <w:u w:val="none"/>
+                <w:strike w:val="false"/>
+                <w:sz w:val="20"/>
+                <w:szCs w:val="20"/>
+                <w:color w:val="000000"/>
+              </w:rPr>
+            </w:pPr>
+            <w:r>
+              <w:rPr>
+                <w:rFonts w:ascii="Helvetica" w:hAnsi="Helvetica" w:eastAsia="Helvetica" w:cs="Helvetica"/>
+                <w:i w:val="false"/>
+                <w:b w:val="true"/>
+                <w:u w:val="none"/>
+                <w:strike w:val="false"/>
                 <w:sz w:val="20"/>
                 <w:szCs w:val="20"/>
                 <w:color w:val="000000"/>
@@ -746,17 +778,19 @@
                 <w:i w:val="false"/>
                 <w:b w:val="true"/>
                 <w:u w:val="none"/>
-                <w:sz w:val="20"/>
-                <w:szCs w:val="20"/>
-                <w:color w:val="000000"/>
-              </w:rPr>
-            </w:pPr>
-            <w:r>
-              <w:rPr>
-                <w:rFonts w:ascii="Helvetica" w:hAnsi="Helvetica" w:eastAsia="Helvetica" w:cs="Helvetica"/>
-                <w:i w:val="false"/>
-                <w:b w:val="true"/>
-                <w:u w:val="none"/>
+                <w:strike w:val="false"/>
+                <w:sz w:val="20"/>
+                <w:szCs w:val="20"/>
+                <w:color w:val="000000"/>
+              </w:rPr>
+            </w:pPr>
+            <w:r>
+              <w:rPr>
+                <w:rFonts w:ascii="Helvetica" w:hAnsi="Helvetica" w:eastAsia="Helvetica" w:cs="Helvetica"/>
+                <w:i w:val="false"/>
+                <w:b w:val="true"/>
+                <w:u w:val="none"/>
+                <w:strike w:val="false"/>
                 <w:sz w:val="20"/>
                 <w:szCs w:val="20"/>
                 <w:color w:val="000000"/>
@@ -804,17 +838,19 @@
                 <w:i w:val="false"/>
                 <w:b w:val="false"/>
                 <w:u w:val="none"/>
-                <w:sz w:val="20"/>
-                <w:szCs w:val="20"/>
-                <w:color w:val="000000"/>
-              </w:rPr>
-            </w:pPr>
-            <w:r>
-              <w:rPr>
-                <w:rFonts w:ascii="Helvetica" w:hAnsi="Helvetica" w:eastAsia="Helvetica" w:cs="Helvetica"/>
-                <w:i w:val="false"/>
-                <w:b w:val="false"/>
-                <w:u w:val="none"/>
+                <w:strike w:val="false"/>
+                <w:sz w:val="20"/>
+                <w:szCs w:val="20"/>
+                <w:color w:val="000000"/>
+              </w:rPr>
+            </w:pPr>
+            <w:r>
+              <w:rPr>
+                <w:rFonts w:ascii="Helvetica" w:hAnsi="Helvetica" w:eastAsia="Helvetica" w:cs="Helvetica"/>
+                <w:i w:val="false"/>
+                <w:b w:val="false"/>
+                <w:u w:val="none"/>
+                <w:strike w:val="false"/>
                 <w:sz w:val="20"/>
                 <w:szCs w:val="20"/>
                 <w:color w:val="000000"/>
@@ -856,17 +892,19 @@
                 <w:i w:val="false"/>
                 <w:b w:val="false"/>
                 <w:u w:val="none"/>
-                <w:sz w:val="20"/>
-                <w:szCs w:val="20"/>
-                <w:color w:val="000000"/>
-              </w:rPr>
-            </w:pPr>
-            <w:r>
-              <w:rPr>
-                <w:rFonts w:ascii="Helvetica" w:hAnsi="Helvetica" w:eastAsia="Helvetica" w:cs="Helvetica"/>
-                <w:i w:val="false"/>
-                <w:b w:val="false"/>
-                <w:u w:val="none"/>
+                <w:strike w:val="false"/>
+                <w:sz w:val="20"/>
+                <w:szCs w:val="20"/>
+                <w:color w:val="000000"/>
+              </w:rPr>
+            </w:pPr>
+            <w:r>
+              <w:rPr>
+                <w:rFonts w:ascii="Helvetica" w:hAnsi="Helvetica" w:eastAsia="Helvetica" w:cs="Helvetica"/>
+                <w:i w:val="false"/>
+                <w:b w:val="false"/>
+                <w:u w:val="none"/>
+                <w:strike w:val="false"/>
                 <w:sz w:val="20"/>
                 <w:szCs w:val="20"/>
                 <w:color w:val="000000"/>
@@ -908,17 +946,19 @@
                 <w:i w:val="false"/>
                 <w:b w:val="false"/>
                 <w:u w:val="none"/>
-                <w:sz w:val="20"/>
-                <w:szCs w:val="20"/>
-                <w:color w:val="000000"/>
-              </w:rPr>
-            </w:pPr>
-            <w:r>
-              <w:rPr>
-                <w:rFonts w:ascii="Helvetica" w:hAnsi="Helvetica" w:eastAsia="Helvetica" w:cs="Helvetica"/>
-                <w:i w:val="false"/>
-                <w:b w:val="false"/>
-                <w:u w:val="none"/>
+                <w:strike w:val="false"/>
+                <w:sz w:val="20"/>
+                <w:szCs w:val="20"/>
+                <w:color w:val="000000"/>
+              </w:rPr>
+            </w:pPr>
+            <w:r>
+              <w:rPr>
+                <w:rFonts w:ascii="Helvetica" w:hAnsi="Helvetica" w:eastAsia="Helvetica" w:cs="Helvetica"/>
+                <w:i w:val="false"/>
+                <w:b w:val="false"/>
+                <w:u w:val="none"/>
+                <w:strike w:val="false"/>
                 <w:sz w:val="20"/>
                 <w:szCs w:val="20"/>
                 <w:color w:val="000000"/>
@@ -960,17 +1000,19 @@
                 <w:i w:val="false"/>
                 <w:b w:val="false"/>
                 <w:u w:val="none"/>
-                <w:sz w:val="20"/>
-                <w:szCs w:val="20"/>
-                <w:color w:val="000000"/>
-              </w:rPr>
-            </w:pPr>
-            <w:r>
-              <w:rPr>
-                <w:rFonts w:ascii="Helvetica" w:hAnsi="Helvetica" w:eastAsia="Helvetica" w:cs="Helvetica"/>
-                <w:i w:val="false"/>
-                <w:b w:val="false"/>
-                <w:u w:val="none"/>
+                <w:strike w:val="false"/>
+                <w:sz w:val="20"/>
+                <w:szCs w:val="20"/>
+                <w:color w:val="000000"/>
+              </w:rPr>
+            </w:pPr>
+            <w:r>
+              <w:rPr>
+                <w:rFonts w:ascii="Helvetica" w:hAnsi="Helvetica" w:eastAsia="Helvetica" w:cs="Helvetica"/>
+                <w:i w:val="false"/>
+                <w:b w:val="false"/>
+                <w:u w:val="none"/>
+                <w:strike w:val="false"/>
                 <w:sz w:val="20"/>
                 <w:szCs w:val="20"/>
                 <w:color w:val="000000"/>
@@ -1012,17 +1054,19 @@
                 <w:i w:val="false"/>
                 <w:b w:val="false"/>
                 <w:u w:val="none"/>
-                <w:sz w:val="20"/>
-                <w:szCs w:val="20"/>
-                <w:color w:val="000000"/>
-              </w:rPr>
-            </w:pPr>
-            <w:r>
-              <w:rPr>
-                <w:rFonts w:ascii="Helvetica" w:hAnsi="Helvetica" w:eastAsia="Helvetica" w:cs="Helvetica"/>
-                <w:i w:val="false"/>
-                <w:b w:val="false"/>
-                <w:u w:val="none"/>
+                <w:strike w:val="false"/>
+                <w:sz w:val="20"/>
+                <w:szCs w:val="20"/>
+                <w:color w:val="000000"/>
+              </w:rPr>
+            </w:pPr>
+            <w:r>
+              <w:rPr>
+                <w:rFonts w:ascii="Helvetica" w:hAnsi="Helvetica" w:eastAsia="Helvetica" w:cs="Helvetica"/>
+                <w:i w:val="false"/>
+                <w:b w:val="false"/>
+                <w:u w:val="none"/>
+                <w:strike w:val="false"/>
                 <w:sz w:val="20"/>
                 <w:szCs w:val="20"/>
                 <w:color w:val="000000"/>
@@ -1064,17 +1108,19 @@
                 <w:i w:val="false"/>
                 <w:b w:val="true"/>
                 <w:u w:val="none"/>
-                <w:sz w:val="20"/>
-                <w:szCs w:val="20"/>
-                <w:color w:val="000000"/>
-              </w:rPr>
-            </w:pPr>
-            <w:r>
-              <w:rPr>
-                <w:rFonts w:ascii="Helvetica" w:hAnsi="Helvetica" w:eastAsia="Helvetica" w:cs="Helvetica"/>
-                <w:i w:val="false"/>
-                <w:b w:val="true"/>
-                <w:u w:val="none"/>
+                <w:strike w:val="false"/>
+                <w:sz w:val="20"/>
+                <w:szCs w:val="20"/>
+                <w:color w:val="000000"/>
+              </w:rPr>
+            </w:pPr>
+            <w:r>
+              <w:rPr>
+                <w:rFonts w:ascii="Helvetica" w:hAnsi="Helvetica" w:eastAsia="Helvetica" w:cs="Helvetica"/>
+                <w:i w:val="false"/>
+                <w:b w:val="true"/>
+                <w:u w:val="none"/>
+                <w:strike w:val="false"/>
                 <w:sz w:val="20"/>
                 <w:szCs w:val="20"/>
                 <w:color w:val="000000"/>
@@ -1122,17 +1168,19 @@
                 <w:i w:val="false"/>
                 <w:b w:val="false"/>
                 <w:u w:val="none"/>
-                <w:sz w:val="20"/>
-                <w:szCs w:val="20"/>
-                <w:color w:val="000000"/>
-              </w:rPr>
-            </w:pPr>
-            <w:r>
-              <w:rPr>
-                <w:rFonts w:ascii="Helvetica" w:hAnsi="Helvetica" w:eastAsia="Helvetica" w:cs="Helvetica"/>
-                <w:i w:val="false"/>
-                <w:b w:val="false"/>
-                <w:u w:val="none"/>
+                <w:strike w:val="false"/>
+                <w:sz w:val="20"/>
+                <w:szCs w:val="20"/>
+                <w:color w:val="000000"/>
+              </w:rPr>
+            </w:pPr>
+            <w:r>
+              <w:rPr>
+                <w:rFonts w:ascii="Helvetica" w:hAnsi="Helvetica" w:eastAsia="Helvetica" w:cs="Helvetica"/>
+                <w:i w:val="false"/>
+                <w:b w:val="false"/>
+                <w:u w:val="none"/>
+                <w:strike w:val="false"/>
                 <w:sz w:val="20"/>
                 <w:szCs w:val="20"/>
                 <w:color w:val="000000"/>
@@ -1174,17 +1222,19 @@
                 <w:i w:val="false"/>
                 <w:b w:val="false"/>
                 <w:u w:val="none"/>
-                <w:sz w:val="20"/>
-                <w:szCs w:val="20"/>
-                <w:color w:val="000000"/>
-              </w:rPr>
-            </w:pPr>
-            <w:r>
-              <w:rPr>
-                <w:rFonts w:ascii="Helvetica" w:hAnsi="Helvetica" w:eastAsia="Helvetica" w:cs="Helvetica"/>
-                <w:i w:val="false"/>
-                <w:b w:val="false"/>
-                <w:u w:val="none"/>
+                <w:strike w:val="false"/>
+                <w:sz w:val="20"/>
+                <w:szCs w:val="20"/>
+                <w:color w:val="000000"/>
+              </w:rPr>
+            </w:pPr>
+            <w:r>
+              <w:rPr>
+                <w:rFonts w:ascii="Helvetica" w:hAnsi="Helvetica" w:eastAsia="Helvetica" w:cs="Helvetica"/>
+                <w:i w:val="false"/>
+                <w:b w:val="false"/>
+                <w:u w:val="none"/>
+                <w:strike w:val="false"/>
                 <w:sz w:val="20"/>
                 <w:szCs w:val="20"/>
                 <w:color w:val="000000"/>
@@ -1226,17 +1276,19 @@
                 <w:i w:val="false"/>
                 <w:b w:val="false"/>
                 <w:u w:val="none"/>
-                <w:sz w:val="20"/>
-                <w:szCs w:val="20"/>
-                <w:color w:val="000000"/>
-              </w:rPr>
-            </w:pPr>
-            <w:r>
-              <w:rPr>
-                <w:rFonts w:ascii="Helvetica" w:hAnsi="Helvetica" w:eastAsia="Helvetica" w:cs="Helvetica"/>
-                <w:i w:val="false"/>
-                <w:b w:val="false"/>
-                <w:u w:val="none"/>
+                <w:strike w:val="false"/>
+                <w:sz w:val="20"/>
+                <w:szCs w:val="20"/>
+                <w:color w:val="000000"/>
+              </w:rPr>
+            </w:pPr>
+            <w:r>
+              <w:rPr>
+                <w:rFonts w:ascii="Helvetica" w:hAnsi="Helvetica" w:eastAsia="Helvetica" w:cs="Helvetica"/>
+                <w:i w:val="false"/>
+                <w:b w:val="false"/>
+                <w:u w:val="none"/>
+                <w:strike w:val="false"/>
                 <w:sz w:val="20"/>
                 <w:szCs w:val="20"/>
                 <w:color w:val="000000"/>
@@ -1278,17 +1330,19 @@
                 <w:i w:val="false"/>
                 <w:b w:val="false"/>
                 <w:u w:val="none"/>
-                <w:sz w:val="20"/>
-                <w:szCs w:val="20"/>
-                <w:color w:val="000000"/>
-              </w:rPr>
-            </w:pPr>
-            <w:r>
-              <w:rPr>
-                <w:rFonts w:ascii="Helvetica" w:hAnsi="Helvetica" w:eastAsia="Helvetica" w:cs="Helvetica"/>
-                <w:i w:val="false"/>
-                <w:b w:val="false"/>
-                <w:u w:val="none"/>
+                <w:strike w:val="false"/>
+                <w:sz w:val="20"/>
+                <w:szCs w:val="20"/>
+                <w:color w:val="000000"/>
+              </w:rPr>
+            </w:pPr>
+            <w:r>
+              <w:rPr>
+                <w:rFonts w:ascii="Helvetica" w:hAnsi="Helvetica" w:eastAsia="Helvetica" w:cs="Helvetica"/>
+                <w:i w:val="false"/>
+                <w:b w:val="false"/>
+                <w:u w:val="none"/>
+                <w:strike w:val="false"/>
                 <w:sz w:val="20"/>
                 <w:szCs w:val="20"/>
                 <w:color w:val="000000"/>
@@ -1330,17 +1384,19 @@
                 <w:i w:val="false"/>
                 <w:b w:val="false"/>
                 <w:u w:val="none"/>
-                <w:sz w:val="20"/>
-                <w:szCs w:val="20"/>
-                <w:color w:val="000000"/>
-              </w:rPr>
-            </w:pPr>
-            <w:r>
-              <w:rPr>
-                <w:rFonts w:ascii="Helvetica" w:hAnsi="Helvetica" w:eastAsia="Helvetica" w:cs="Helvetica"/>
-                <w:i w:val="false"/>
-                <w:b w:val="false"/>
-                <w:u w:val="none"/>
+                <w:strike w:val="false"/>
+                <w:sz w:val="20"/>
+                <w:szCs w:val="20"/>
+                <w:color w:val="000000"/>
+              </w:rPr>
+            </w:pPr>
+            <w:r>
+              <w:rPr>
+                <w:rFonts w:ascii="Helvetica" w:hAnsi="Helvetica" w:eastAsia="Helvetica" w:cs="Helvetica"/>
+                <w:i w:val="false"/>
+                <w:b w:val="false"/>
+                <w:u w:val="none"/>
+                <w:strike w:val="false"/>
                 <w:sz w:val="20"/>
                 <w:szCs w:val="20"/>
                 <w:color w:val="000000"/>
@@ -1382,17 +1438,19 @@
                 <w:i w:val="false"/>
                 <w:b w:val="true"/>
                 <w:u w:val="none"/>
-                <w:sz w:val="20"/>
-                <w:szCs w:val="20"/>
-                <w:color w:val="000000"/>
-              </w:rPr>
-            </w:pPr>
-            <w:r>
-              <w:rPr>
-                <w:rFonts w:ascii="Helvetica" w:hAnsi="Helvetica" w:eastAsia="Helvetica" w:cs="Helvetica"/>
-                <w:i w:val="false"/>
-                <w:b w:val="true"/>
-                <w:u w:val="none"/>
+                <w:strike w:val="false"/>
+                <w:sz w:val="20"/>
+                <w:szCs w:val="20"/>
+                <w:color w:val="000000"/>
+              </w:rPr>
+            </w:pPr>
+            <w:r>
+              <w:rPr>
+                <w:rFonts w:ascii="Helvetica" w:hAnsi="Helvetica" w:eastAsia="Helvetica" w:cs="Helvetica"/>
+                <w:i w:val="false"/>
+                <w:b w:val="true"/>
+                <w:u w:val="none"/>
+                <w:strike w:val="false"/>
                 <w:sz w:val="20"/>
                 <w:szCs w:val="20"/>
                 <w:color w:val="000000"/>
@@ -1440,17 +1498,19 @@
                 <w:i w:val="false"/>
                 <w:b w:val="true"/>
                 <w:u w:val="none"/>
-                <w:sz w:val="20"/>
-                <w:szCs w:val="20"/>
-                <w:color w:val="000000"/>
-              </w:rPr>
-            </w:pPr>
-            <w:r>
-              <w:rPr>
-                <w:rFonts w:ascii="Helvetica" w:hAnsi="Helvetica" w:eastAsia="Helvetica" w:cs="Helvetica"/>
-                <w:i w:val="false"/>
-                <w:b w:val="true"/>
-                <w:u w:val="none"/>
+                <w:strike w:val="false"/>
+                <w:sz w:val="20"/>
+                <w:szCs w:val="20"/>
+                <w:color w:val="000000"/>
+              </w:rPr>
+            </w:pPr>
+            <w:r>
+              <w:rPr>
+                <w:rFonts w:ascii="Helvetica" w:hAnsi="Helvetica" w:eastAsia="Helvetica" w:cs="Helvetica"/>
+                <w:i w:val="false"/>
+                <w:b w:val="true"/>
+                <w:u w:val="none"/>
+                <w:strike w:val="false"/>
                 <w:sz w:val="20"/>
                 <w:szCs w:val="20"/>
                 <w:color w:val="000000"/>
@@ -1492,17 +1552,19 @@
                 <w:i w:val="false"/>
                 <w:b w:val="true"/>
                 <w:u w:val="none"/>
-                <w:sz w:val="20"/>
-                <w:szCs w:val="20"/>
-                <w:color w:val="000000"/>
-              </w:rPr>
-            </w:pPr>
-            <w:r>
-              <w:rPr>
-                <w:rFonts w:ascii="Helvetica" w:hAnsi="Helvetica" w:eastAsia="Helvetica" w:cs="Helvetica"/>
-                <w:i w:val="false"/>
-                <w:b w:val="true"/>
-                <w:u w:val="none"/>
+                <w:strike w:val="false"/>
+                <w:sz w:val="20"/>
+                <w:szCs w:val="20"/>
+                <w:color w:val="000000"/>
+              </w:rPr>
+            </w:pPr>
+            <w:r>
+              <w:rPr>
+                <w:rFonts w:ascii="Helvetica" w:hAnsi="Helvetica" w:eastAsia="Helvetica" w:cs="Helvetica"/>
+                <w:i w:val="false"/>
+                <w:b w:val="true"/>
+                <w:u w:val="none"/>
+                <w:strike w:val="false"/>
                 <w:sz w:val="20"/>
                 <w:szCs w:val="20"/>
                 <w:color w:val="000000"/>
@@ -1544,17 +1606,19 @@
                 <w:i w:val="false"/>
                 <w:b w:val="true"/>
                 <w:u w:val="none"/>
-                <w:sz w:val="20"/>
-                <w:szCs w:val="20"/>
-                <w:color w:val="000000"/>
-              </w:rPr>
-            </w:pPr>
-            <w:r>
-              <w:rPr>
-                <w:rFonts w:ascii="Helvetica" w:hAnsi="Helvetica" w:eastAsia="Helvetica" w:cs="Helvetica"/>
-                <w:i w:val="false"/>
-                <w:b w:val="true"/>
-                <w:u w:val="none"/>
+                <w:strike w:val="false"/>
+                <w:sz w:val="20"/>
+                <w:szCs w:val="20"/>
+                <w:color w:val="000000"/>
+              </w:rPr>
+            </w:pPr>
+            <w:r>
+              <w:rPr>
+                <w:rFonts w:ascii="Helvetica" w:hAnsi="Helvetica" w:eastAsia="Helvetica" w:cs="Helvetica"/>
+                <w:i w:val="false"/>
+                <w:b w:val="true"/>
+                <w:u w:val="none"/>
+                <w:strike w:val="false"/>
                 <w:sz w:val="20"/>
                 <w:szCs w:val="20"/>
                 <w:color w:val="000000"/>
@@ -1596,17 +1660,19 @@
                 <w:i w:val="false"/>
                 <w:b w:val="true"/>
                 <w:u w:val="none"/>
-                <w:sz w:val="20"/>
-                <w:szCs w:val="20"/>
-                <w:color w:val="000000"/>
-              </w:rPr>
-            </w:pPr>
-            <w:r>
-              <w:rPr>
-                <w:rFonts w:ascii="Helvetica" w:hAnsi="Helvetica" w:eastAsia="Helvetica" w:cs="Helvetica"/>
-                <w:i w:val="false"/>
-                <w:b w:val="true"/>
-                <w:u w:val="none"/>
+                <w:strike w:val="false"/>
+                <w:sz w:val="20"/>
+                <w:szCs w:val="20"/>
+                <w:color w:val="000000"/>
+              </w:rPr>
+            </w:pPr>
+            <w:r>
+              <w:rPr>
+                <w:rFonts w:ascii="Helvetica" w:hAnsi="Helvetica" w:eastAsia="Helvetica" w:cs="Helvetica"/>
+                <w:i w:val="false"/>
+                <w:b w:val="true"/>
+                <w:u w:val="none"/>
+                <w:strike w:val="false"/>
                 <w:sz w:val="20"/>
                 <w:szCs w:val="20"/>
                 <w:color w:val="000000"/>
@@ -1648,17 +1714,19 @@
                 <w:i w:val="false"/>
                 <w:b w:val="true"/>
                 <w:u w:val="none"/>
-                <w:sz w:val="20"/>
-                <w:szCs w:val="20"/>
-                <w:color w:val="000000"/>
-              </w:rPr>
-            </w:pPr>
-            <w:r>
-              <w:rPr>
-                <w:rFonts w:ascii="Helvetica" w:hAnsi="Helvetica" w:eastAsia="Helvetica" w:cs="Helvetica"/>
-                <w:i w:val="false"/>
-                <w:b w:val="true"/>
-                <w:u w:val="none"/>
+                <w:strike w:val="false"/>
+                <w:sz w:val="20"/>
+                <w:szCs w:val="20"/>
+                <w:color w:val="000000"/>
+              </w:rPr>
+            </w:pPr>
+            <w:r>
+              <w:rPr>
+                <w:rFonts w:ascii="Helvetica" w:hAnsi="Helvetica" w:eastAsia="Helvetica" w:cs="Helvetica"/>
+                <w:i w:val="false"/>
+                <w:b w:val="true"/>
+                <w:u w:val="none"/>
+                <w:strike w:val="false"/>
                 <w:sz w:val="20"/>
                 <w:szCs w:val="20"/>
                 <w:color w:val="000000"/>
@@ -1700,17 +1768,19 @@
                 <w:i w:val="false"/>
                 <w:b w:val="true"/>
                 <w:u w:val="none"/>
-                <w:sz w:val="20"/>
-                <w:szCs w:val="20"/>
-                <w:color w:val="000000"/>
-              </w:rPr>
-            </w:pPr>
-            <w:r>
-              <w:rPr>
-                <w:rFonts w:ascii="Helvetica" w:hAnsi="Helvetica" w:eastAsia="Helvetica" w:cs="Helvetica"/>
-                <w:i w:val="false"/>
-                <w:b w:val="true"/>
-                <w:u w:val="none"/>
+                <w:strike w:val="false"/>
+                <w:sz w:val="20"/>
+                <w:szCs w:val="20"/>
+                <w:color w:val="000000"/>
+              </w:rPr>
+            </w:pPr>
+            <w:r>
+              <w:rPr>
+                <w:rFonts w:ascii="Helvetica" w:hAnsi="Helvetica" w:eastAsia="Helvetica" w:cs="Helvetica"/>
+                <w:i w:val="false"/>
+                <w:b w:val="true"/>
+                <w:u w:val="none"/>
+                <w:strike w:val="false"/>
                 <w:sz w:val="20"/>
                 <w:szCs w:val="20"/>
                 <w:color w:val="000000"/>
@@ -1758,17 +1828,19 @@
                 <w:i w:val="false"/>
                 <w:b w:val="false"/>
                 <w:u w:val="none"/>
-                <w:sz w:val="20"/>
-                <w:szCs w:val="20"/>
-                <w:color w:val="000000"/>
-              </w:rPr>
-            </w:pPr>
-            <w:r>
-              <w:rPr>
-                <w:rFonts w:ascii="Helvetica" w:hAnsi="Helvetica" w:eastAsia="Helvetica" w:cs="Helvetica"/>
-                <w:i w:val="false"/>
-                <w:b w:val="false"/>
-                <w:u w:val="none"/>
+                <w:strike w:val="false"/>
+                <w:sz w:val="20"/>
+                <w:szCs w:val="20"/>
+                <w:color w:val="000000"/>
+              </w:rPr>
+            </w:pPr>
+            <w:r>
+              <w:rPr>
+                <w:rFonts w:ascii="Helvetica" w:hAnsi="Helvetica" w:eastAsia="Helvetica" w:cs="Helvetica"/>
+                <w:i w:val="false"/>
+                <w:b w:val="false"/>
+                <w:u w:val="none"/>
+                <w:strike w:val="false"/>
                 <w:sz w:val="20"/>
                 <w:szCs w:val="20"/>
                 <w:color w:val="000000"/>
@@ -1810,17 +1882,19 @@
                 <w:i w:val="false"/>
                 <w:b w:val="false"/>
                 <w:u w:val="none"/>
-                <w:sz w:val="20"/>
-                <w:szCs w:val="20"/>
-                <w:color w:val="000000"/>
-              </w:rPr>
-            </w:pPr>
-            <w:r>
-              <w:rPr>
-                <w:rFonts w:ascii="Helvetica" w:hAnsi="Helvetica" w:eastAsia="Helvetica" w:cs="Helvetica"/>
-                <w:i w:val="false"/>
-                <w:b w:val="false"/>
-                <w:u w:val="none"/>
+                <w:strike w:val="false"/>
+                <w:sz w:val="20"/>
+                <w:szCs w:val="20"/>
+                <w:color w:val="000000"/>
+              </w:rPr>
+            </w:pPr>
+            <w:r>
+              <w:rPr>
+                <w:rFonts w:ascii="Helvetica" w:hAnsi="Helvetica" w:eastAsia="Helvetica" w:cs="Helvetica"/>
+                <w:i w:val="false"/>
+                <w:b w:val="false"/>
+                <w:u w:val="none"/>
+                <w:strike w:val="false"/>
                 <w:sz w:val="20"/>
                 <w:szCs w:val="20"/>
                 <w:color w:val="000000"/>
@@ -1862,17 +1936,19 @@
                 <w:i w:val="false"/>
                 <w:b w:val="false"/>
                 <w:u w:val="none"/>
-                <w:sz w:val="20"/>
-                <w:szCs w:val="20"/>
-                <w:color w:val="000000"/>
-              </w:rPr>
-            </w:pPr>
-            <w:r>
-              <w:rPr>
-                <w:rFonts w:ascii="Helvetica" w:hAnsi="Helvetica" w:eastAsia="Helvetica" w:cs="Helvetica"/>
-                <w:i w:val="false"/>
-                <w:b w:val="false"/>
-                <w:u w:val="none"/>
+                <w:strike w:val="false"/>
+                <w:sz w:val="20"/>
+                <w:szCs w:val="20"/>
+                <w:color w:val="000000"/>
+              </w:rPr>
+            </w:pPr>
+            <w:r>
+              <w:rPr>
+                <w:rFonts w:ascii="Helvetica" w:hAnsi="Helvetica" w:eastAsia="Helvetica" w:cs="Helvetica"/>
+                <w:i w:val="false"/>
+                <w:b w:val="false"/>
+                <w:u w:val="none"/>
+                <w:strike w:val="false"/>
                 <w:sz w:val="20"/>
                 <w:szCs w:val="20"/>
                 <w:color w:val="000000"/>
@@ -1914,17 +1990,19 @@
                 <w:i w:val="false"/>
                 <w:b w:val="false"/>
                 <w:u w:val="none"/>
-                <w:sz w:val="20"/>
-                <w:szCs w:val="20"/>
-                <w:color w:val="000000"/>
-              </w:rPr>
-            </w:pPr>
-            <w:r>
-              <w:rPr>
-                <w:rFonts w:ascii="Helvetica" w:hAnsi="Helvetica" w:eastAsia="Helvetica" w:cs="Helvetica"/>
-                <w:i w:val="false"/>
-                <w:b w:val="false"/>
-                <w:u w:val="none"/>
+                <w:strike w:val="false"/>
+                <w:sz w:val="20"/>
+                <w:szCs w:val="20"/>
+                <w:color w:val="000000"/>
+              </w:rPr>
+            </w:pPr>
+            <w:r>
+              <w:rPr>
+                <w:rFonts w:ascii="Helvetica" w:hAnsi="Helvetica" w:eastAsia="Helvetica" w:cs="Helvetica"/>
+                <w:i w:val="false"/>
+                <w:b w:val="false"/>
+                <w:u w:val="none"/>
+                <w:strike w:val="false"/>
                 <w:sz w:val="20"/>
                 <w:szCs w:val="20"/>
                 <w:color w:val="000000"/>
@@ -1966,17 +2044,19 @@
                 <w:i w:val="false"/>
                 <w:b w:val="false"/>
                 <w:u w:val="none"/>
-                <w:sz w:val="20"/>
-                <w:szCs w:val="20"/>
-                <w:color w:val="000000"/>
-              </w:rPr>
-            </w:pPr>
-            <w:r>
-              <w:rPr>
-                <w:rFonts w:ascii="Helvetica" w:hAnsi="Helvetica" w:eastAsia="Helvetica" w:cs="Helvetica"/>
-                <w:i w:val="false"/>
-                <w:b w:val="false"/>
-                <w:u w:val="none"/>
+                <w:strike w:val="false"/>
+                <w:sz w:val="20"/>
+                <w:szCs w:val="20"/>
+                <w:color w:val="000000"/>
+              </w:rPr>
+            </w:pPr>
+            <w:r>
+              <w:rPr>
+                <w:rFonts w:ascii="Helvetica" w:hAnsi="Helvetica" w:eastAsia="Helvetica" w:cs="Helvetica"/>
+                <w:i w:val="false"/>
+                <w:b w:val="false"/>
+                <w:u w:val="none"/>
+                <w:strike w:val="false"/>
                 <w:sz w:val="20"/>
                 <w:szCs w:val="20"/>
                 <w:color w:val="000000"/>
@@ -2018,17 +2098,19 @@
                 <w:i w:val="false"/>
                 <w:b w:val="true"/>
                 <w:u w:val="none"/>
-                <w:sz w:val="20"/>
-                <w:szCs w:val="20"/>
-                <w:color w:val="000000"/>
-              </w:rPr>
-            </w:pPr>
-            <w:r>
-              <w:rPr>
-                <w:rFonts w:ascii="Helvetica" w:hAnsi="Helvetica" w:eastAsia="Helvetica" w:cs="Helvetica"/>
-                <w:i w:val="false"/>
-                <w:b w:val="true"/>
-                <w:u w:val="none"/>
+                <w:strike w:val="false"/>
+                <w:sz w:val="20"/>
+                <w:szCs w:val="20"/>
+                <w:color w:val="000000"/>
+              </w:rPr>
+            </w:pPr>
+            <w:r>
+              <w:rPr>
+                <w:rFonts w:ascii="Helvetica" w:hAnsi="Helvetica" w:eastAsia="Helvetica" w:cs="Helvetica"/>
+                <w:i w:val="false"/>
+                <w:b w:val="true"/>
+                <w:u w:val="none"/>
+                <w:strike w:val="false"/>
                 <w:sz w:val="20"/>
                 <w:szCs w:val="20"/>
                 <w:color w:val="000000"/>
@@ -2076,17 +2158,19 @@
                 <w:i w:val="false"/>
                 <w:b w:val="false"/>
                 <w:u w:val="none"/>
-                <w:sz w:val="20"/>
-                <w:szCs w:val="20"/>
-                <w:color w:val="000000"/>
-              </w:rPr>
-            </w:pPr>
-            <w:r>
-              <w:rPr>
-                <w:rFonts w:ascii="Helvetica" w:hAnsi="Helvetica" w:eastAsia="Helvetica" w:cs="Helvetica"/>
-                <w:i w:val="false"/>
-                <w:b w:val="false"/>
-                <w:u w:val="none"/>
+                <w:strike w:val="false"/>
+                <w:sz w:val="20"/>
+                <w:szCs w:val="20"/>
+                <w:color w:val="000000"/>
+              </w:rPr>
+            </w:pPr>
+            <w:r>
+              <w:rPr>
+                <w:rFonts w:ascii="Helvetica" w:hAnsi="Helvetica" w:eastAsia="Helvetica" w:cs="Helvetica"/>
+                <w:i w:val="false"/>
+                <w:b w:val="false"/>
+                <w:u w:val="none"/>
+                <w:strike w:val="false"/>
                 <w:sz w:val="20"/>
                 <w:szCs w:val="20"/>
                 <w:color w:val="000000"/>
@@ -2128,17 +2212,19 @@
                 <w:i w:val="false"/>
                 <w:b w:val="false"/>
                 <w:u w:val="none"/>
-                <w:sz w:val="20"/>
-                <w:szCs w:val="20"/>
-                <w:color w:val="000000"/>
-              </w:rPr>
-            </w:pPr>
-            <w:r>
-              <w:rPr>
-                <w:rFonts w:ascii="Helvetica" w:hAnsi="Helvetica" w:eastAsia="Helvetica" w:cs="Helvetica"/>
-                <w:i w:val="false"/>
-                <w:b w:val="false"/>
-                <w:u w:val="none"/>
+                <w:strike w:val="false"/>
+                <w:sz w:val="20"/>
+                <w:szCs w:val="20"/>
+                <w:color w:val="000000"/>
+              </w:rPr>
+            </w:pPr>
+            <w:r>
+              <w:rPr>
+                <w:rFonts w:ascii="Helvetica" w:hAnsi="Helvetica" w:eastAsia="Helvetica" w:cs="Helvetica"/>
+                <w:i w:val="false"/>
+                <w:b w:val="false"/>
+                <w:u w:val="none"/>
+                <w:strike w:val="false"/>
                 <w:sz w:val="20"/>
                 <w:szCs w:val="20"/>
                 <w:color w:val="000000"/>
@@ -2180,17 +2266,19 @@
                 <w:i w:val="false"/>
                 <w:b w:val="false"/>
                 <w:u w:val="none"/>
-                <w:sz w:val="20"/>
-                <w:szCs w:val="20"/>
-                <w:color w:val="000000"/>
-              </w:rPr>
-            </w:pPr>
-            <w:r>
-              <w:rPr>
-                <w:rFonts w:ascii="Helvetica" w:hAnsi="Helvetica" w:eastAsia="Helvetica" w:cs="Helvetica"/>
-                <w:i w:val="false"/>
-                <w:b w:val="false"/>
-                <w:u w:val="none"/>
+                <w:strike w:val="false"/>
+                <w:sz w:val="20"/>
+                <w:szCs w:val="20"/>
+                <w:color w:val="000000"/>
+              </w:rPr>
+            </w:pPr>
+            <w:r>
+              <w:rPr>
+                <w:rFonts w:ascii="Helvetica" w:hAnsi="Helvetica" w:eastAsia="Helvetica" w:cs="Helvetica"/>
+                <w:i w:val="false"/>
+                <w:b w:val="false"/>
+                <w:u w:val="none"/>
+                <w:strike w:val="false"/>
                 <w:sz w:val="20"/>
                 <w:szCs w:val="20"/>
                 <w:color w:val="000000"/>
@@ -2232,17 +2320,19 @@
                 <w:i w:val="false"/>
                 <w:b w:val="false"/>
                 <w:u w:val="none"/>
-                <w:sz w:val="20"/>
-                <w:szCs w:val="20"/>
-                <w:color w:val="000000"/>
-              </w:rPr>
-            </w:pPr>
-            <w:r>
-              <w:rPr>
-                <w:rFonts w:ascii="Helvetica" w:hAnsi="Helvetica" w:eastAsia="Helvetica" w:cs="Helvetica"/>
-                <w:i w:val="false"/>
-                <w:b w:val="false"/>
-                <w:u w:val="none"/>
+                <w:strike w:val="false"/>
+                <w:sz w:val="20"/>
+                <w:szCs w:val="20"/>
+                <w:color w:val="000000"/>
+              </w:rPr>
+            </w:pPr>
+            <w:r>
+              <w:rPr>
+                <w:rFonts w:ascii="Helvetica" w:hAnsi="Helvetica" w:eastAsia="Helvetica" w:cs="Helvetica"/>
+                <w:i w:val="false"/>
+                <w:b w:val="false"/>
+                <w:u w:val="none"/>
+                <w:strike w:val="false"/>
                 <w:sz w:val="20"/>
                 <w:szCs w:val="20"/>
                 <w:color w:val="000000"/>
@@ -2284,17 +2374,19 @@
                 <w:i w:val="false"/>
                 <w:b w:val="false"/>
                 <w:u w:val="none"/>
-                <w:sz w:val="20"/>
-                <w:szCs w:val="20"/>
-                <w:color w:val="000000"/>
-              </w:rPr>
-            </w:pPr>
-            <w:r>
-              <w:rPr>
-                <w:rFonts w:ascii="Helvetica" w:hAnsi="Helvetica" w:eastAsia="Helvetica" w:cs="Helvetica"/>
-                <w:i w:val="false"/>
-                <w:b w:val="false"/>
-                <w:u w:val="none"/>
+                <w:strike w:val="false"/>
+                <w:sz w:val="20"/>
+                <w:szCs w:val="20"/>
+                <w:color w:val="000000"/>
+              </w:rPr>
+            </w:pPr>
+            <w:r>
+              <w:rPr>
+                <w:rFonts w:ascii="Helvetica" w:hAnsi="Helvetica" w:eastAsia="Helvetica" w:cs="Helvetica"/>
+                <w:i w:val="false"/>
+                <w:b w:val="false"/>
+                <w:u w:val="none"/>
+                <w:strike w:val="false"/>
                 <w:sz w:val="20"/>
                 <w:szCs w:val="20"/>
                 <w:color w:val="000000"/>
@@ -2336,17 +2428,19 @@
                 <w:i w:val="false"/>
                 <w:b w:val="true"/>
                 <w:u w:val="none"/>
-                <w:sz w:val="20"/>
-                <w:szCs w:val="20"/>
-                <w:color w:val="000000"/>
-              </w:rPr>
-            </w:pPr>
-            <w:r>
-              <w:rPr>
-                <w:rFonts w:ascii="Helvetica" w:hAnsi="Helvetica" w:eastAsia="Helvetica" w:cs="Helvetica"/>
-                <w:i w:val="false"/>
-                <w:b w:val="true"/>
-                <w:u w:val="none"/>
+                <w:strike w:val="false"/>
+                <w:sz w:val="20"/>
+                <w:szCs w:val="20"/>
+                <w:color w:val="000000"/>
+              </w:rPr>
+            </w:pPr>
+            <w:r>
+              <w:rPr>
+                <w:rFonts w:ascii="Helvetica" w:hAnsi="Helvetica" w:eastAsia="Helvetica" w:cs="Helvetica"/>
+                <w:i w:val="false"/>
+                <w:b w:val="true"/>
+                <w:u w:val="none"/>
+                <w:strike w:val="false"/>
                 <w:sz w:val="20"/>
                 <w:szCs w:val="20"/>
                 <w:color w:val="000000"/>
@@ -2394,17 +2488,19 @@
                 <w:i w:val="false"/>
                 <w:b w:val="false"/>
                 <w:u w:val="none"/>
-                <w:sz w:val="20"/>
-                <w:szCs w:val="20"/>
-                <w:color w:val="000000"/>
-              </w:rPr>
-            </w:pPr>
-            <w:r>
-              <w:rPr>
-                <w:rFonts w:ascii="Helvetica" w:hAnsi="Helvetica" w:eastAsia="Helvetica" w:cs="Helvetica"/>
-                <w:i w:val="false"/>
-                <w:b w:val="false"/>
-                <w:u w:val="none"/>
+                <w:strike w:val="false"/>
+                <w:sz w:val="20"/>
+                <w:szCs w:val="20"/>
+                <w:color w:val="000000"/>
+              </w:rPr>
+            </w:pPr>
+            <w:r>
+              <w:rPr>
+                <w:rFonts w:ascii="Helvetica" w:hAnsi="Helvetica" w:eastAsia="Helvetica" w:cs="Helvetica"/>
+                <w:i w:val="false"/>
+                <w:b w:val="false"/>
+                <w:u w:val="none"/>
+                <w:strike w:val="false"/>
                 <w:sz w:val="20"/>
                 <w:szCs w:val="20"/>
                 <w:color w:val="000000"/>
@@ -2446,17 +2542,19 @@
                 <w:i w:val="false"/>
                 <w:b w:val="false"/>
                 <w:u w:val="none"/>
-                <w:sz w:val="20"/>
-                <w:szCs w:val="20"/>
-                <w:color w:val="000000"/>
-              </w:rPr>
-            </w:pPr>
-            <w:r>
-              <w:rPr>
-                <w:rFonts w:ascii="Helvetica" w:hAnsi="Helvetica" w:eastAsia="Helvetica" w:cs="Helvetica"/>
-                <w:i w:val="false"/>
-                <w:b w:val="false"/>
-                <w:u w:val="none"/>
+                <w:strike w:val="false"/>
+                <w:sz w:val="20"/>
+                <w:szCs w:val="20"/>
+                <w:color w:val="000000"/>
+              </w:rPr>
+            </w:pPr>
+            <w:r>
+              <w:rPr>
+                <w:rFonts w:ascii="Helvetica" w:hAnsi="Helvetica" w:eastAsia="Helvetica" w:cs="Helvetica"/>
+                <w:i w:val="false"/>
+                <w:b w:val="false"/>
+                <w:u w:val="none"/>
+                <w:strike w:val="false"/>
                 <w:sz w:val="20"/>
                 <w:szCs w:val="20"/>
                 <w:color w:val="000000"/>
@@ -2498,17 +2596,19 @@
                 <w:i w:val="false"/>
                 <w:b w:val="false"/>
                 <w:u w:val="none"/>
-                <w:sz w:val="20"/>
-                <w:szCs w:val="20"/>
-                <w:color w:val="000000"/>
-              </w:rPr>
-            </w:pPr>
-            <w:r>
-              <w:rPr>
-                <w:rFonts w:ascii="Helvetica" w:hAnsi="Helvetica" w:eastAsia="Helvetica" w:cs="Helvetica"/>
-                <w:i w:val="false"/>
-                <w:b w:val="false"/>
-                <w:u w:val="none"/>
+                <w:strike w:val="false"/>
+                <w:sz w:val="20"/>
+                <w:szCs w:val="20"/>
+                <w:color w:val="000000"/>
+              </w:rPr>
+            </w:pPr>
+            <w:r>
+              <w:rPr>
+                <w:rFonts w:ascii="Helvetica" w:hAnsi="Helvetica" w:eastAsia="Helvetica" w:cs="Helvetica"/>
+                <w:i w:val="false"/>
+                <w:b w:val="false"/>
+                <w:u w:val="none"/>
+                <w:strike w:val="false"/>
                 <w:sz w:val="20"/>
                 <w:szCs w:val="20"/>
                 <w:color w:val="000000"/>
@@ -2550,17 +2650,19 @@
                 <w:i w:val="false"/>
                 <w:b w:val="false"/>
                 <w:u w:val="none"/>
-                <w:sz w:val="20"/>
-                <w:szCs w:val="20"/>
-                <w:color w:val="000000"/>
-              </w:rPr>
-            </w:pPr>
-            <w:r>
-              <w:rPr>
-                <w:rFonts w:ascii="Helvetica" w:hAnsi="Helvetica" w:eastAsia="Helvetica" w:cs="Helvetica"/>
-                <w:i w:val="false"/>
-                <w:b w:val="false"/>
-                <w:u w:val="none"/>
+                <w:strike w:val="false"/>
+                <w:sz w:val="20"/>
+                <w:szCs w:val="20"/>
+                <w:color w:val="000000"/>
+              </w:rPr>
+            </w:pPr>
+            <w:r>
+              <w:rPr>
+                <w:rFonts w:ascii="Helvetica" w:hAnsi="Helvetica" w:eastAsia="Helvetica" w:cs="Helvetica"/>
+                <w:i w:val="false"/>
+                <w:b w:val="false"/>
+                <w:u w:val="none"/>
+                <w:strike w:val="false"/>
                 <w:sz w:val="20"/>
                 <w:szCs w:val="20"/>
                 <w:color w:val="000000"/>
@@ -2602,17 +2704,19 @@
                 <w:i w:val="false"/>
                 <w:b w:val="false"/>
                 <w:u w:val="none"/>
-                <w:sz w:val="20"/>
-                <w:szCs w:val="20"/>
-                <w:color w:val="000000"/>
-              </w:rPr>
-            </w:pPr>
-            <w:r>
-              <w:rPr>
-                <w:rFonts w:ascii="Helvetica" w:hAnsi="Helvetica" w:eastAsia="Helvetica" w:cs="Helvetica"/>
-                <w:i w:val="false"/>
-                <w:b w:val="false"/>
-                <w:u w:val="none"/>
+                <w:strike w:val="false"/>
+                <w:sz w:val="20"/>
+                <w:szCs w:val="20"/>
+                <w:color w:val="000000"/>
+              </w:rPr>
+            </w:pPr>
+            <w:r>
+              <w:rPr>
+                <w:rFonts w:ascii="Helvetica" w:hAnsi="Helvetica" w:eastAsia="Helvetica" w:cs="Helvetica"/>
+                <w:i w:val="false"/>
+                <w:b w:val="false"/>
+                <w:u w:val="none"/>
+                <w:strike w:val="false"/>
                 <w:sz w:val="20"/>
                 <w:szCs w:val="20"/>
                 <w:color w:val="000000"/>
@@ -2654,17 +2758,19 @@
                 <w:i w:val="false"/>
                 <w:b w:val="true"/>
                 <w:u w:val="none"/>
-                <w:sz w:val="20"/>
-                <w:szCs w:val="20"/>
-                <w:color w:val="000000"/>
-              </w:rPr>
-            </w:pPr>
-            <w:r>
-              <w:rPr>
-                <w:rFonts w:ascii="Helvetica" w:hAnsi="Helvetica" w:eastAsia="Helvetica" w:cs="Helvetica"/>
-                <w:i w:val="false"/>
-                <w:b w:val="true"/>
-                <w:u w:val="none"/>
+                <w:strike w:val="false"/>
+                <w:sz w:val="20"/>
+                <w:szCs w:val="20"/>
+                <w:color w:val="000000"/>
+              </w:rPr>
+            </w:pPr>
+            <w:r>
+              <w:rPr>
+                <w:rFonts w:ascii="Helvetica" w:hAnsi="Helvetica" w:eastAsia="Helvetica" w:cs="Helvetica"/>
+                <w:i w:val="false"/>
+                <w:b w:val="true"/>
+                <w:u w:val="none"/>
+                <w:strike w:val="false"/>
                 <w:sz w:val="20"/>
                 <w:szCs w:val="20"/>
                 <w:color w:val="000000"/>
@@ -2712,17 +2818,19 @@
                 <w:i w:val="false"/>
                 <w:b w:val="false"/>
                 <w:u w:val="none"/>
-                <w:sz w:val="20"/>
-                <w:szCs w:val="20"/>
-                <w:color w:val="000000"/>
-              </w:rPr>
-            </w:pPr>
-            <w:r>
-              <w:rPr>
-                <w:rFonts w:ascii="Helvetica" w:hAnsi="Helvetica" w:eastAsia="Helvetica" w:cs="Helvetica"/>
-                <w:i w:val="false"/>
-                <w:b w:val="false"/>
-                <w:u w:val="none"/>
+                <w:strike w:val="false"/>
+                <w:sz w:val="20"/>
+                <w:szCs w:val="20"/>
+                <w:color w:val="000000"/>
+              </w:rPr>
+            </w:pPr>
+            <w:r>
+              <w:rPr>
+                <w:rFonts w:ascii="Helvetica" w:hAnsi="Helvetica" w:eastAsia="Helvetica" w:cs="Helvetica"/>
+                <w:i w:val="false"/>
+                <w:b w:val="false"/>
+                <w:u w:val="none"/>
+                <w:strike w:val="false"/>
                 <w:sz w:val="20"/>
                 <w:szCs w:val="20"/>
                 <w:color w:val="000000"/>
@@ -2764,17 +2872,19 @@
                 <w:i w:val="false"/>
                 <w:b w:val="false"/>
                 <w:u w:val="none"/>
-                <w:sz w:val="20"/>
-                <w:szCs w:val="20"/>
-                <w:color w:val="000000"/>
-              </w:rPr>
-            </w:pPr>
-            <w:r>
-              <w:rPr>
-                <w:rFonts w:ascii="Helvetica" w:hAnsi="Helvetica" w:eastAsia="Helvetica" w:cs="Helvetica"/>
-                <w:i w:val="false"/>
-                <w:b w:val="false"/>
-                <w:u w:val="none"/>
+                <w:strike w:val="false"/>
+                <w:sz w:val="20"/>
+                <w:szCs w:val="20"/>
+                <w:color w:val="000000"/>
+              </w:rPr>
+            </w:pPr>
+            <w:r>
+              <w:rPr>
+                <w:rFonts w:ascii="Helvetica" w:hAnsi="Helvetica" w:eastAsia="Helvetica" w:cs="Helvetica"/>
+                <w:i w:val="false"/>
+                <w:b w:val="false"/>
+                <w:u w:val="none"/>
+                <w:strike w:val="false"/>
                 <w:sz w:val="20"/>
                 <w:szCs w:val="20"/>
                 <w:color w:val="000000"/>
@@ -2816,17 +2926,19 @@
                 <w:i w:val="false"/>
                 <w:b w:val="false"/>
                 <w:u w:val="none"/>
-                <w:sz w:val="20"/>
-                <w:szCs w:val="20"/>
-                <w:color w:val="000000"/>
-              </w:rPr>
-            </w:pPr>
-            <w:r>
-              <w:rPr>
-                <w:rFonts w:ascii="Helvetica" w:hAnsi="Helvetica" w:eastAsia="Helvetica" w:cs="Helvetica"/>
-                <w:i w:val="false"/>
-                <w:b w:val="false"/>
-                <w:u w:val="none"/>
+                <w:strike w:val="false"/>
+                <w:sz w:val="20"/>
+                <w:szCs w:val="20"/>
+                <w:color w:val="000000"/>
+              </w:rPr>
+            </w:pPr>
+            <w:r>
+              <w:rPr>
+                <w:rFonts w:ascii="Helvetica" w:hAnsi="Helvetica" w:eastAsia="Helvetica" w:cs="Helvetica"/>
+                <w:i w:val="false"/>
+                <w:b w:val="false"/>
+                <w:u w:val="none"/>
+                <w:strike w:val="false"/>
                 <w:sz w:val="20"/>
                 <w:szCs w:val="20"/>
                 <w:color w:val="000000"/>
@@ -2868,17 +2980,19 @@
                 <w:i w:val="false"/>
                 <w:b w:val="false"/>
                 <w:u w:val="none"/>
-                <w:sz w:val="20"/>
-                <w:szCs w:val="20"/>
-                <w:color w:val="000000"/>
-              </w:rPr>
-            </w:pPr>
-            <w:r>
-              <w:rPr>
-                <w:rFonts w:ascii="Helvetica" w:hAnsi="Helvetica" w:eastAsia="Helvetica" w:cs="Helvetica"/>
-                <w:i w:val="false"/>
-                <w:b w:val="false"/>
-                <w:u w:val="none"/>
+                <w:strike w:val="false"/>
+                <w:sz w:val="20"/>
+                <w:szCs w:val="20"/>
+                <w:color w:val="000000"/>
+              </w:rPr>
+            </w:pPr>
+            <w:r>
+              <w:rPr>
+                <w:rFonts w:ascii="Helvetica" w:hAnsi="Helvetica" w:eastAsia="Helvetica" w:cs="Helvetica"/>
+                <w:i w:val="false"/>
+                <w:b w:val="false"/>
+                <w:u w:val="none"/>
+                <w:strike w:val="false"/>
                 <w:sz w:val="20"/>
                 <w:szCs w:val="20"/>
                 <w:color w:val="000000"/>
@@ -2920,17 +3034,19 @@
                 <w:i w:val="false"/>
                 <w:b w:val="false"/>
                 <w:u w:val="none"/>
-                <w:sz w:val="20"/>
-                <w:szCs w:val="20"/>
-                <w:color w:val="000000"/>
-              </w:rPr>
-            </w:pPr>
-            <w:r>
-              <w:rPr>
-                <w:rFonts w:ascii="Helvetica" w:hAnsi="Helvetica" w:eastAsia="Helvetica" w:cs="Helvetica"/>
-                <w:i w:val="false"/>
-                <w:b w:val="false"/>
-                <w:u w:val="none"/>
+                <w:strike w:val="false"/>
+                <w:sz w:val="20"/>
+                <w:szCs w:val="20"/>
+                <w:color w:val="000000"/>
+              </w:rPr>
+            </w:pPr>
+            <w:r>
+              <w:rPr>
+                <w:rFonts w:ascii="Helvetica" w:hAnsi="Helvetica" w:eastAsia="Helvetica" w:cs="Helvetica"/>
+                <w:i w:val="false"/>
+                <w:b w:val="false"/>
+                <w:u w:val="none"/>
+                <w:strike w:val="false"/>
                 <w:sz w:val="20"/>
                 <w:szCs w:val="20"/>
                 <w:color w:val="000000"/>
@@ -2972,17 +3088,19 @@
                 <w:i w:val="false"/>
                 <w:b w:val="true"/>
                 <w:u w:val="none"/>
-                <w:sz w:val="20"/>
-                <w:szCs w:val="20"/>
-                <w:color w:val="000000"/>
-              </w:rPr>
-            </w:pPr>
-            <w:r>
-              <w:rPr>
-                <w:rFonts w:ascii="Helvetica" w:hAnsi="Helvetica" w:eastAsia="Helvetica" w:cs="Helvetica"/>
-                <w:i w:val="false"/>
-                <w:b w:val="true"/>
-                <w:u w:val="none"/>
+                <w:strike w:val="false"/>
+                <w:sz w:val="20"/>
+                <w:szCs w:val="20"/>
+                <w:color w:val="000000"/>
+              </w:rPr>
+            </w:pPr>
+            <w:r>
+              <w:rPr>
+                <w:rFonts w:ascii="Helvetica" w:hAnsi="Helvetica" w:eastAsia="Helvetica" w:cs="Helvetica"/>
+                <w:i w:val="false"/>
+                <w:b w:val="true"/>
+                <w:u w:val="none"/>
+                <w:strike w:val="false"/>
                 <w:sz w:val="20"/>
                 <w:szCs w:val="20"/>
                 <w:color w:val="000000"/>

</xml_diff>